<commit_message>
Deploy preview for PR 654 🛫
</commit_message>
<xml_diff>
--- a/pr-preview/pr-654/vignettes/articles/version-crosswalk-1.3-to-1.4.docx
+++ b/pr-preview/pr-654/vignettes/articles/version-crosswalk-1.3-to-1.4.docx
@@ -3067,7 +3067,7 @@
         <w:rPr>
           <w:rStyle w:val="CommentTok"/>
         </w:rPr>
-        <w:t xml:space="preserve">#&gt; 1 13.0  1     HlyE_IgA    0.788</w:t>
+        <w:t xml:space="preserve">#&gt; 1  17.3 1     HlyE_IgA    0.206</w:t>
       </w:r>
       <w:r>
         <w:br/>
@@ -3076,7 +3076,7 @@
         <w:rPr>
           <w:rStyle w:val="CommentTok"/>
         </w:rPr>
-        <w:t xml:space="preserve">#&gt; 2 13.0  1     HlyE_IgG    6.42 </w:t>
+        <w:t xml:space="preserve">#&gt; 2  17.3 1     HlyE_IgG    0.780</w:t>
       </w:r>
       <w:r>
         <w:br/>
@@ -3085,7 +3085,7 @@
         <w:rPr>
           <w:rStyle w:val="CommentTok"/>
         </w:rPr>
-        <w:t xml:space="preserve">#&gt; 3  8.52 2     HlyE_IgA    0.299</w:t>
+        <w:t xml:space="preserve">#&gt; 3   5   2     HlyE_IgA    0.828</w:t>
       </w:r>
       <w:r>
         <w:br/>
@@ -3094,7 +3094,7 @@
         <w:rPr>
           <w:rStyle w:val="CommentTok"/>
         </w:rPr>
-        <w:t xml:space="preserve">#&gt; 4  8.52 2     HlyE_IgG    5.07 </w:t>
+        <w:t xml:space="preserve">#&gt; 4   5   2     HlyE_IgG    5.14 </w:t>
       </w:r>
       <w:r>
         <w:br/>
@@ -3103,7 +3103,7 @@
         <w:rPr>
           <w:rStyle w:val="CommentTok"/>
         </w:rPr>
-        <w:t xml:space="preserve">#&gt; 5  4.07 3     HlyE_IgA    0.505</w:t>
+        <w:t xml:space="preserve">#&gt; 5  16.9 3     HlyE_IgA    0.679</w:t>
       </w:r>
       <w:r>
         <w:br/>
@@ -3112,7 +3112,7 @@
         <w:rPr>
           <w:rStyle w:val="CommentTok"/>
         </w:rPr>
-        <w:t xml:space="preserve">#&gt; 6  4.07 3     HlyE_IgG    0.646</w:t>
+        <w:t xml:space="preserve">#&gt; 6  16.9 3     HlyE_IgG    0.413</w:t>
       </w:r>
       <w:r>
         <w:br/>

</xml_diff>